<commit_message>
Improve dashboard comparisons and proposal
</commit_message>
<xml_diff>
--- a/proposal/Proposal_initial_draft.docx
+++ b/proposal/Proposal_initial_draft.docx
@@ -185,6 +185,19 @@
     </w:p>
     <w:p>
       <w:pPr>
+        <w:pStyle w:val="Title"/>
+        <w:jc w:val="left"/>
+      </w:pPr>
+      <w:r>
+        <w:rPr>
+          <w:color w:val="000000"/>
+          <w:sz w:val="32"/>
+        </w:rPr>
+        <w:t>International Student Policy and Economic Indicators Research Proposal</w:t>
+      </w:r>
+    </w:p>
+    <w:p>
+      <w:pPr>
         <w:jc w:val="both"/>
       </w:pPr>
       <w:r>
@@ -768,7 +781,7 @@
         <w:pStyle w:val="isselectedend"/>
       </w:pPr>
       <w:r>
-        <w:t>The study will focus primarily on recent policy developments during the current Trump administration.</w:t>
+        <w:t>The study will focus on U.S. policy developments affecting international students during 2025–2026.</w:t>
       </w:r>
     </w:p>
     <w:p>
@@ -834,14 +847,7 @@
         <w:spacing w:before="100" w:beforeAutospacing="1" w:after="100" w:afterAutospacing="1"/>
       </w:pPr>
       <w:r>
-        <w:rPr>
-          <w:rStyle w:val="Strong"/>
-          <w:rFonts w:eastAsiaTheme="majorEastAsia"/>
-        </w:rPr>
-        <w:t>Mobility data:</w:t>
-      </w:r>
-      <w:r>
-        <w:t xml:space="preserve"> enrollment, visa issuance, or other student-flow indicators used as supporting context.</w:t>
+        <w:t>Mobility data: enrollment, student visa issuance, I-94 arrivals, and active SEVIS counts used as supporting context.</w:t>
       </w:r>
     </w:p>
     <w:p>
@@ -1215,25 +1221,16 @@
     </w:p>
     <w:p>
       <w:pPr>
+        <w:pStyle w:val="Heading2"/>
         <w:rPr>
           <w:noProof/>
         </w:rPr>
       </w:pPr>
       <w:r>
         <w:rPr>
-          <w:b/>
-          <w:bCs/>
-          <w:noProof/>
-          <w:sz w:val="27"/>
-          <w:szCs w:val="27"/>
+          <w:color w:val="000000"/>
         </w:rPr>
-        <w:t>Potential Modelling: Institutional and Economic Impact</w:t>
-      </w:r>
-      <w:r>
-        <w:rPr>
-          <w:noProof/>
-        </w:rPr>
-        <w:t>:</w:t>
+        <w:t>Potential Modeling and Economic Indicators</w:t>
       </w:r>
     </w:p>
     <w:p>
@@ -1250,7 +1247,7 @@
         <w:jc w:val="both"/>
       </w:pPr>
       <w:r>
-        <w:t>This project may also explore forecasting future international student enrollment or visa trends using historical data and time-series or other predictive methods. These forecasts could be used to estimate possible future changes in student mobility under different scenarios.</w:t>
+        <w:t>The study may forecast international enrollment and visa trends under stated scenarios. Forecasts will be checked against held-out historical periods and reported with uncertainty intervals.</w:t>
       </w:r>
     </w:p>
     <w:p>
@@ -1259,7 +1256,7 @@
         <w:jc w:val="both"/>
       </w:pPr>
       <w:r>
-        <w:t>The project also aims to project the tuition revenue U.S. universities could lose under different enrollment decline scenarios.</w:t>
+        <w:t>Institutional exposure will be estimated from international enrollment counts and shares. Tuition-revenue scenarios will use published tuition and aid data where comparable measures are available; they will not be described as observed losses.</w:t>
       </w:r>
     </w:p>
     <w:p>
@@ -1268,7 +1265,7 @@
         <w:jc w:val="both"/>
       </w:pPr>
       <w:r>
-        <w:t>Universities may be grouped into risk types based on their share of international students, reliance on tuition revenue, and financial buffers such as endowment size.</w:t>
+        <w:t>Campuses may be grouped by international enrollment share, tuition reliance, and financial buffers when comparable institutional data are available.</w:t>
       </w:r>
     </w:p>
     <w:p>
@@ -1277,7 +1274,55 @@
         <w:jc w:val="both"/>
       </w:pPr>
       <w:r>
-        <w:t>The analysis may then estimate how revenue losses could affect university staffing, including faculty positions, graduate teaching and research assistantships, and administrative roles. This could help identify which institutions and academic programs may be more exposed to sustained declines in international student enrollment.</w:t>
+        <w:t>Existing repository indicators are campus exposure (IPEDS and Census), nearby asking rents (Zillow ZORI), college and county jobs, wages, and establishments (BLS QCEW), monthly education, leisure-and-hospitality, retail and total jobs (BLS CES), and federal research grants (USAspending). BEA education-related travel exports have a collector but no committed processed file.</w:t>
+      </w:r>
+    </w:p>
+    <w:p>
+      <w:r/>
+      <w:r>
+        <w:rPr>
+          <w:b/>
+        </w:rPr>
+        <w:t>Mobility context:</w:t>
+      </w:r>
+      <w:r>
+        <w:t xml:space="preserve"> State Department student visas, NTTO I-94 student arrivals, and DHS SEVIS active-student counts. These do not directly measure local spending or jobs.</w:t>
+      </w:r>
+    </w:p>
+    <w:p>
+      <w:r/>
+      <w:r>
+        <w:rPr>
+          <w:b/>
+        </w:rPr>
+        <w:t>Nearby hotels:</w:t>
+      </w:r>
+      <w:r>
+        <w:t xml:space="preserve"> proposed room nights, occupancy, room rates, or lodging-tax receipts where local data exist. County accommodation jobs and wages (BLS QCEW, NAICS 7211) are a possible fallback, subject to suppression.</w:t>
+      </w:r>
+    </w:p>
+    <w:p>
+      <w:r/>
+      <w:r>
+        <w:rPr>
+          <w:b/>
+        </w:rPr>
+        <w:t>Flights:</w:t>
+      </w:r>
+      <w:r>
+        <w:t xml:space="preserve"> proposed monthly passengers and seats at airports serving selected campuses (BTS T-100), checked against FAA annual boardings. Neither source identifies student travelers.</w:t>
+      </w:r>
+    </w:p>
+    <w:p>
+      <w:r/>
+      <w:r>
+        <w:rPr>
+          <w:b/>
+        </w:rPr>
+        <w:t>Verification:</w:t>
+      </w:r>
+      <w:r>
+        <w:t xml:space="preserve"> check geographic fit, coverage, definitions, missing values, revisions, and seasonality before use. Hotel and flight series are not yet in the repository. Compare similar markets where possible; report associations, not causal effects.</w:t>
       </w:r>
     </w:p>
     <w:p>
@@ -1457,6 +1502,58 @@
     </w:p>
     <w:p>
       <w:r>
+        <w:t xml:space="preserve">4) </w:t>
+      </w:r>
+      <w:hyperlink r:id="rId9">
+        <w:r>
+          <w:rPr>
+            <w:color w:val="0563C1"/>
+          </w:rPr>
+          <w:t>Project economic-indicator pipeline, policy-timeline branch</w:t>
+        </w:r>
+      </w:hyperlink>
+    </w:p>
+    <w:p>
+      <w:r>
+        <w:t xml:space="preserve">5) </w:t>
+      </w:r>
+      <w:hyperlink r:id="rId10">
+        <w:r>
+          <w:rPr>
+            <w:color w:val="0563C1"/>
+          </w:rPr>
+          <w:t>BLS QCEW county employment and wages</w:t>
+        </w:r>
+      </w:hyperlink>
+    </w:p>
+    <w:p>
+      <w:r>
+        <w:t xml:space="preserve">6) </w:t>
+      </w:r>
+      <w:hyperlink r:id="rId11">
+        <w:r>
+          <w:rPr>
+            <w:color w:val="0563C1"/>
+          </w:rPr>
+          <w:t>BTS T-100 air traffic data</w:t>
+        </w:r>
+      </w:hyperlink>
+    </w:p>
+    <w:p>
+      <w:r>
+        <w:t xml:space="preserve">7) </w:t>
+      </w:r>
+      <w:hyperlink r:id="rId12">
+        <w:r>
+          <w:rPr>
+            <w:color w:val="0563C1"/>
+          </w:rPr>
+          <w:t>FAA passenger enplanements</w:t>
+        </w:r>
+      </w:hyperlink>
+    </w:p>
+    <w:p>
+      <w:r>
         <w:rPr>
           <w:noProof/>
         </w:rPr>
@@ -1468,78 +1565,6 @@
         <w:pict w14:anchorId="11964C37">
           <v:rect id="_x0000_i1033" alt="" style="width:468pt;height:.05pt;mso-width-percent:0;mso-height-percent:0;mso-width-percent:0;mso-height-percent:0" o:hralign="center" o:hrstd="t" o:hr="t" fillcolor="#a0a0a0" stroked="f"/>
         </w:pict>
-      </w:r>
-    </w:p>
-    <w:p>
-      <w:pPr>
-        <w:spacing w:before="100" w:beforeAutospacing="1" w:after="100" w:afterAutospacing="1"/>
-        <w:outlineLvl w:val="2"/>
-        <w:rPr>
-          <w:b/>
-          <w:bCs/>
-          <w:sz w:val="27"/>
-          <w:szCs w:val="27"/>
-        </w:rPr>
-      </w:pPr>
-      <w:r>
-        <w:rPr>
-          <w:b/>
-          <w:bCs/>
-          <w:sz w:val="27"/>
-          <w:szCs w:val="27"/>
-        </w:rPr>
-        <w:t>Project Timeline</w:t>
-      </w:r>
-    </w:p>
-    <w:p>
-      <w:pPr>
-        <w:spacing w:before="100" w:beforeAutospacing="1" w:after="100" w:afterAutospacing="1"/>
-        <w:outlineLvl w:val="2"/>
-        <w:rPr>
-          <w:b/>
-          <w:bCs/>
-        </w:rPr>
-      </w:pPr>
-      <w:r>
-        <w:rPr>
-          <w:b/>
-          <w:bCs/>
-        </w:rPr>
-        <w:t>Week 1:</w:t>
-      </w:r>
-    </w:p>
-    <w:p>
-      <w:pPr>
-        <w:spacing w:before="100" w:beforeAutospacing="1" w:after="100" w:afterAutospacing="1"/>
-        <w:outlineLvl w:val="2"/>
-        <w:rPr>
-          <w:b/>
-          <w:bCs/>
-        </w:rPr>
-      </w:pPr>
-      <w:r>
-        <w:rPr>
-          <w:b/>
-          <w:bCs/>
-        </w:rPr>
-        <w:t>Week 2:</w:t>
-      </w:r>
-    </w:p>
-    <w:p>
-      <w:pPr>
-        <w:spacing w:before="100" w:beforeAutospacing="1" w:after="100" w:afterAutospacing="1"/>
-        <w:outlineLvl w:val="2"/>
-        <w:rPr>
-          <w:b/>
-          <w:bCs/>
-        </w:rPr>
-      </w:pPr>
-      <w:r>
-        <w:rPr>
-          <w:b/>
-          <w:bCs/>
-        </w:rPr>
-        <w:t>Week 3:</w:t>
       </w:r>
     </w:p>
     <w:p>

</xml_diff>